<commit_message>
docs: regenera .docx/.pdf com a medicao on-target do ESP32 (Tabela 11)
Co-Authored-By: Claude Opus 4.8 <noreply@anthropic.com>
</commit_message>
<xml_diff>
--- a/artigo/GhostPredict_Documentacao.docx
+++ b/artigo/GhostPredict_Documentacao.docx
@@ -13924,7 +13924,277 @@
           <w:i w:val="0"/>
           <w:sz w:val="22"/>
         </w:rPr>
-        <w:t>Essa validação deixou de ser apenas uma proposta. O repositório inclui, em embedded/, um decodificador de referência em C sem alocação dinâmica, com todo o estado em memória estática, portado de ghost_core.rs e empacotado como componente ESP-IDF. Ele foi verificado bit a bit contra o motor Rust nos vetores de conformidade e em mensagens reais, em modo normal e com prior, com doze de doze casos exatos. A análise estática desse binário pela ferramenta size, equivalente ao que o idf.py size faz no alvo, reporta cerca de 19 KB na seção .bss e cerca de 4 KB de código para o decodificador normal, o que confirma a linha do decodificador da Tabela 8 por um método independente do alocador instrumentado. O modo com prior, que adiciona as tabelas LZ do aquecimento, sobe para cerca de 259 KB de .bss, ainda dentro da RAM de um ESP32.</w:t>
+        <w:t>Essa validação deixou de ser apenas uma proposta. O repositório inclui, em embedded/, um decodificador de referência em C sem alocação dinâmica, com todo o estado em memória estática, portado de ghost_core.rs e empacotado como componente ESP-IDF. Ele foi verificado bit a bit contra o motor Rust nos vetores de conformidade e em mensagens reais, em modo normal e com prior, com doze de doze casos exatos. Compilado para o ESP32 com o ESP-IDF, o relatório idf.py size-components atribui ao componente do decodificador 19.692 bytes na seção .bss, 1.811 bytes de código em flash e 220 bytes de constantes, no alvo xtensa real. A Tabela 11 reúne as três medições independentes de RAM do decodificador, que convergem em torno de 19 KB e confirmam a linha da Tabela 8 no próprio hardware de destino.</w:t>
+      </w:r>
+    </w:p>
+    <w:p>
+      <w:pPr>
+        <w:spacing w:before="120" w:after="80"/>
+        <w:jc w:val="center"/>
+      </w:pPr>
+      <w:r>
+        <w:rPr>
+          <w:rFonts w:ascii="Arial" w:hAnsi="Arial"/>
+          <w:b/>
+          <w:i w:val="0"/>
+          <w:sz w:val="19"/>
+        </w:rPr>
+        <w:t>Tabela 11. Footprint de RAM do decodificador por três métodos independentes.</w:t>
+      </w:r>
+    </w:p>
+    <w:tbl>
+      <w:tblPr>
+        <w:tblStyle w:val="TableGrid"/>
+        <w:tblW w:type="auto" w:w="0"/>
+        <w:jc w:val="center"/>
+        <w:tblLook w:firstColumn="1" w:firstRow="1" w:lastColumn="0" w:lastRow="0" w:noHBand="0" w:noVBand="1" w:val="04A0"/>
+      </w:tblPr>
+      <w:tblGrid>
+        <w:gridCol w:w="2986"/>
+        <w:gridCol w:w="2986"/>
+        <w:gridCol w:w="2986"/>
+      </w:tblGrid>
+      <w:tr>
+        <w:tc>
+          <w:tcPr>
+            <w:tcW w:type="dxa" w:w="2986"/>
+          </w:tcPr>
+          <w:p>
+            <w:pPr>
+              <w:jc w:val="center"/>
+            </w:pPr>
+            <w:r/>
+            <w:r>
+              <w:rPr>
+                <w:rFonts w:ascii="Times New Roman" w:hAnsi="Times New Roman"/>
+                <w:b/>
+                <w:sz w:val="20"/>
+              </w:rPr>
+              <w:t>Método</w:t>
+            </w:r>
+          </w:p>
+        </w:tc>
+        <w:tc>
+          <w:tcPr>
+            <w:tcW w:type="dxa" w:w="2986"/>
+          </w:tcPr>
+          <w:p>
+            <w:pPr>
+              <w:jc w:val="center"/>
+            </w:pPr>
+            <w:r/>
+            <w:r>
+              <w:rPr>
+                <w:rFonts w:ascii="Times New Roman" w:hAnsi="Times New Roman"/>
+                <w:b/>
+                <w:sz w:val="20"/>
+              </w:rPr>
+              <w:t>Onde</w:t>
+            </w:r>
+          </w:p>
+        </w:tc>
+        <w:tc>
+          <w:tcPr>
+            <w:tcW w:type="dxa" w:w="2986"/>
+          </w:tcPr>
+          <w:p>
+            <w:pPr>
+              <w:jc w:val="center"/>
+            </w:pPr>
+            <w:r/>
+            <w:r>
+              <w:rPr>
+                <w:rFonts w:ascii="Times New Roman" w:hAnsi="Times New Roman"/>
+                <w:b/>
+                <w:sz w:val="20"/>
+              </w:rPr>
+              <w:t>RAM do decodificador</w:t>
+            </w:r>
+          </w:p>
+        </w:tc>
+      </w:tr>
+      <w:tr>
+        <w:tc>
+          <w:tcPr>
+            <w:tcW w:type="dxa" w:w="2986"/>
+          </w:tcPr>
+          <w:p>
+            <w:pPr>
+              <w:jc w:val="left"/>
+            </w:pPr>
+            <w:r/>
+            <w:r>
+              <w:rPr>
+                <w:rFonts w:ascii="Times New Roman" w:hAnsi="Times New Roman"/>
+                <w:sz w:val="20"/>
+              </w:rPr>
+              <w:t>Alocador instrumentado</w:t>
+            </w:r>
+          </w:p>
+        </w:tc>
+        <w:tc>
+          <w:tcPr>
+            <w:tcW w:type="dxa" w:w="2986"/>
+          </w:tcPr>
+          <w:p>
+            <w:pPr>
+              <w:jc w:val="center"/>
+            </w:pPr>
+            <w:r/>
+            <w:r>
+              <w:rPr>
+                <w:rFonts w:ascii="Times New Roman" w:hAnsi="Times New Roman"/>
+                <w:sz w:val="20"/>
+              </w:rPr>
+              <w:t>motor Rust (PC)</w:t>
+            </w:r>
+          </w:p>
+        </w:tc>
+        <w:tc>
+          <w:tcPr>
+            <w:tcW w:type="dxa" w:w="2986"/>
+          </w:tcPr>
+          <w:p>
+            <w:pPr>
+              <w:jc w:val="center"/>
+            </w:pPr>
+            <w:r/>
+            <w:r>
+              <w:rPr>
+                <w:rFonts w:ascii="Times New Roman" w:hAnsi="Times New Roman"/>
+                <w:sz w:val="20"/>
+              </w:rPr>
+              <w:t>19.083 B</w:t>
+            </w:r>
+          </w:p>
+        </w:tc>
+      </w:tr>
+      <w:tr>
+        <w:tc>
+          <w:tcPr>
+            <w:tcW w:type="dxa" w:w="2986"/>
+          </w:tcPr>
+          <w:p>
+            <w:pPr>
+              <w:jc w:val="left"/>
+            </w:pPr>
+            <w:r/>
+            <w:r>
+              <w:rPr>
+                <w:rFonts w:ascii="Times New Roman" w:hAnsi="Times New Roman"/>
+                <w:sz w:val="20"/>
+              </w:rPr>
+              <w:t>size no objeto</w:t>
+            </w:r>
+          </w:p>
+        </w:tc>
+        <w:tc>
+          <w:tcPr>
+            <w:tcW w:type="dxa" w:w="2986"/>
+          </w:tcPr>
+          <w:p>
+            <w:pPr>
+              <w:jc w:val="center"/>
+            </w:pPr>
+            <w:r/>
+            <w:r>
+              <w:rPr>
+                <w:rFonts w:ascii="Times New Roman" w:hAnsi="Times New Roman"/>
+                <w:sz w:val="20"/>
+              </w:rPr>
+              <w:t>C compilado no PC (x86)</w:t>
+            </w:r>
+          </w:p>
+        </w:tc>
+        <w:tc>
+          <w:tcPr>
+            <w:tcW w:type="dxa" w:w="2986"/>
+          </w:tcPr>
+          <w:p>
+            <w:pPr>
+              <w:jc w:val="center"/>
+            </w:pPr>
+            <w:r/>
+            <w:r>
+              <w:rPr>
+                <w:rFonts w:ascii="Times New Roman" w:hAnsi="Times New Roman"/>
+                <w:sz w:val="20"/>
+              </w:rPr>
+              <w:t>19.776 B</w:t>
+            </w:r>
+          </w:p>
+        </w:tc>
+      </w:tr>
+      <w:tr>
+        <w:tc>
+          <w:tcPr>
+            <w:tcW w:type="dxa" w:w="2986"/>
+          </w:tcPr>
+          <w:p>
+            <w:pPr>
+              <w:jc w:val="left"/>
+            </w:pPr>
+            <w:r/>
+            <w:r>
+              <w:rPr>
+                <w:rFonts w:ascii="Times New Roman" w:hAnsi="Times New Roman"/>
+                <w:sz w:val="20"/>
+              </w:rPr>
+              <w:t>idf.py size-components</w:t>
+            </w:r>
+          </w:p>
+        </w:tc>
+        <w:tc>
+          <w:tcPr>
+            <w:tcW w:type="dxa" w:w="2986"/>
+          </w:tcPr>
+          <w:p>
+            <w:pPr>
+              <w:jc w:val="center"/>
+            </w:pPr>
+            <w:r/>
+            <w:r>
+              <w:rPr>
+                <w:rFonts w:ascii="Times New Roman" w:hAnsi="Times New Roman"/>
+                <w:sz w:val="20"/>
+              </w:rPr>
+              <w:t>ESP32 (xtensa)</w:t>
+            </w:r>
+          </w:p>
+        </w:tc>
+        <w:tc>
+          <w:tcPr>
+            <w:tcW w:type="dxa" w:w="2986"/>
+          </w:tcPr>
+          <w:p>
+            <w:pPr>
+              <w:jc w:val="center"/>
+            </w:pPr>
+            <w:r/>
+            <w:r>
+              <w:rPr>
+                <w:rFonts w:ascii="Times New Roman" w:hAnsi="Times New Roman"/>
+                <w:sz w:val="20"/>
+              </w:rPr>
+              <w:t>19.692 B</w:t>
+            </w:r>
+          </w:p>
+        </w:tc>
+      </w:tr>
+    </w:tbl>
+    <w:p>
+      <w:pPr>
+        <w:spacing w:before="0" w:after="120"/>
+        <w:jc w:val="both"/>
+      </w:pPr>
+      <w:r>
+        <w:rPr>
+          <w:rFonts w:ascii="Times New Roman" w:hAnsi="Times New Roman"/>
+          <w:b w:val="0"/>
+          <w:i w:val="0"/>
+          <w:sz w:val="22"/>
+        </w:rPr>
+        <w:t>O modo com prior, que adiciona as tabelas LZ do aquecimento, sobe para cerca de 259 KB de memória estática, ainda dentro da RAM de um ESP32. O firmware completo do exemplo, com todo o núcleo do ESP-IDF, ocupou cerca de 150 KB, deixando livre a maior parte da partição de aplicação.</w:t>
       </w:r>
     </w:p>
     <w:p>

</xml_diff>

<commit_message>
docs: guia de reproducao ponta a ponta (decoder C, ESP-IDF), decisoes metodologicas e apendices ambiente/troubleshooting
Co-Authored-By: Claude Opus 4.8 <noreply@anthropic.com>
</commit_message>
<xml_diff>
--- a/artigo/GhostPredict_Documentacao.docx
+++ b/artigo/GhostPredict_Documentacao.docx
@@ -5980,7 +5980,7 @@
           <w:b/>
           <w:color w:val="000000"/>
         </w:rPr>
-        <w:t>10.4. Passo a passo da reprodução</w:t>
+        <w:t>10.4. Pré-requisitos</w:t>
       </w:r>
     </w:p>
     <w:p>
@@ -5995,7 +5995,35 @@
           <w:i w:val="0"/>
           <w:sz w:val="22"/>
         </w:rPr>
-        <w:t>A sequência completa, a partir do repositório com os dados em datasets, é:</w:t>
+        <w:t>A reprodução exige um pequeno conjunto de ferramentas, todas verificadas pelo próprio benchmark.py antes de iniciar. São elas o compilador Rust com a cadeia GNU; o compilador C, para os especialistas de string curta; os utilitários zstd, xz, gzip e brotli no caminho de busca; e o interpretador Python com a biblioteca psutil, opcional, para a medição de memória. As versões usadas estão no Apêndice D. Os conjuntos de dados, por serem grandes, não acompanham o repositório; suas fontes públicas estão na Tabela 1, e a estrutura de pastas esperada está documentada nas funções de extração do benchmark.py.</w:t>
+      </w:r>
+    </w:p>
+    <w:p>
+      <w:pPr>
+        <w:pStyle w:val="Heading2"/>
+      </w:pPr>
+      <w:r>
+        <w:rPr>
+          <w:rFonts w:ascii="Times New Roman" w:hAnsi="Times New Roman"/>
+          <w:b/>
+          <w:color w:val="000000"/>
+        </w:rPr>
+        <w:t>10.5. Passo a passo da reprodução</w:t>
+      </w:r>
+    </w:p>
+    <w:p>
+      <w:pPr>
+        <w:spacing w:before="0" w:after="120"/>
+        <w:jc w:val="both"/>
+      </w:pPr>
+      <w:r>
+        <w:rPr>
+          <w:rFonts w:ascii="Times New Roman" w:hAnsi="Times New Roman"/>
+          <w:b w:val="0"/>
+          <w:i w:val="0"/>
+          <w:sz w:val="22"/>
+        </w:rPr>
+        <w:t>A sequência completa, a partir do repositório com os dados em datasets, é a seguinte. Os comandos de compilação dos especialistas de string curta usam o gcc; os demais são diretos.</w:t>
       </w:r>
     </w:p>
     <w:p>
@@ -6010,7 +6038,7 @@
           <w:rFonts w:ascii="Consolas" w:hAnsi="Consolas"/>
           <w:sz w:val="17"/>
         </w:rPr>
-        <w:t># 1. compilar o motor</w:t>
+        <w:t># 1. compilar o motor (cadeia GNU; o ligador MSVC falha neste projeto)</w:t>
       </w:r>
     </w:p>
     <w:p>
@@ -6040,7 +6068,7 @@
           <w:rFonts w:ascii="Consolas" w:hAnsi="Consolas"/>
           <w:sz w:val="17"/>
         </w:rPr>
-        <w:t># 2. verificar a corretude</w:t>
+        <w:t xml:space="preserve"> </w:t>
       </w:r>
     </w:p>
     <w:p>
@@ -6055,7 +6083,7 @@
           <w:rFonts w:ascii="Consolas" w:hAnsi="Consolas"/>
           <w:sz w:val="17"/>
         </w:rPr>
-        <w:t>main.exe t</w:t>
+        <w:t># 2. verificar a corretude (round-trip bit a bit + nunca inflar + tamanhos de referencia)</w:t>
       </w:r>
     </w:p>
     <w:p>
@@ -6070,7 +6098,7 @@
           <w:rFonts w:ascii="Consolas" w:hAnsi="Consolas"/>
           <w:sz w:val="17"/>
         </w:rPr>
-        <w:t># 3. (opcional) gerar um primer de dominio e recompilar para usar cp/dp</w:t>
+        <w:t>main.exe t</w:t>
       </w:r>
     </w:p>
     <w:p>
@@ -6085,7 +6113,7 @@
           <w:rFonts w:ascii="Consolas" w:hAnsi="Consolas"/>
           <w:sz w:val="17"/>
         </w:rPr>
-        <w:t>python gen_primer.py --from-dataset datasets/.../loop_1.csv --skip-header</w:t>
+        <w:t xml:space="preserve"> </w:t>
       </w:r>
     </w:p>
     <w:p>
@@ -6100,7 +6128,7 @@
           <w:rFonts w:ascii="Consolas" w:hAnsi="Consolas"/>
           <w:sz w:val="17"/>
         </w:rPr>
-        <w:t>rustc +stable-x86_64-pc-windows-gnu -C opt-level=3 main.rs -o main.exe</w:t>
+        <w:t># 3. compilar os baselines Unishox2 e SMAZ (uma vez)</w:t>
       </w:r>
     </w:p>
     <w:p>
@@ -6115,7 +6143,7 @@
           <w:rFonts w:ascii="Consolas" w:hAnsi="Consolas"/>
           <w:sz w:val="17"/>
         </w:rPr>
-        <w:t># 4. rodar a validacao em dados reais (gera resultados_reais.json)</w:t>
+        <w:t>gcc -O2 -o tools/short/uni_cli.exe  tools/short/uni_cli.c  tools/short/unishox2.c</w:t>
       </w:r>
     </w:p>
     <w:p>
@@ -6130,7 +6158,7 @@
           <w:rFonts w:ascii="Consolas" w:hAnsi="Consolas"/>
           <w:sz w:val="17"/>
         </w:rPr>
-        <w:t>python benchmark.py</w:t>
+        <w:t>gcc -O2 -o tools/short/smaz_cli.exe tools/short/smaz_cli.c tools/short/smaz.c</w:t>
       </w:r>
     </w:p>
     <w:p>
@@ -6145,7 +6173,7 @@
           <w:rFonts w:ascii="Consolas" w:hAnsi="Consolas"/>
           <w:sz w:val="17"/>
         </w:rPr>
-        <w:t># 5. gerar o artigo e esta documentacao a partir dos resultados</w:t>
+        <w:t xml:space="preserve"> </w:t>
       </w:r>
     </w:p>
     <w:p>
@@ -6160,7 +6188,7 @@
           <w:rFonts w:ascii="Consolas" w:hAnsi="Consolas"/>
           <w:sz w:val="17"/>
         </w:rPr>
-        <w:t>python gen_artigo.py</w:t>
+        <w:t># 4. (opcional) gerar um primer de dominio e recompilar para usar cp/dp embutido</w:t>
       </w:r>
     </w:p>
     <w:p>
@@ -6175,6 +6203,141 @@
           <w:rFonts w:ascii="Consolas" w:hAnsi="Consolas"/>
           <w:sz w:val="17"/>
         </w:rPr>
+        <w:t>python gen_primer.py --from-dataset datasets/.../loop_1.csv --skip-header</w:t>
+      </w:r>
+    </w:p>
+    <w:p>
+      <w:pPr>
+        <w:spacing w:before="0" w:after="0" w:line="240" w:lineRule="auto"/>
+        <w:ind w:left="113"/>
+        <w:jc w:val="left"/>
+        <w:shd w:val="clear" w:fill="F2F2F2"/>
+      </w:pPr>
+      <w:r>
+        <w:rPr>
+          <w:rFonts w:ascii="Consolas" w:hAnsi="Consolas"/>
+          <w:sz w:val="17"/>
+        </w:rPr>
+        <w:t>rustc +stable-x86_64-pc-windows-gnu -C opt-level=3 main.rs -o main.exe</w:t>
+      </w:r>
+    </w:p>
+    <w:p>
+      <w:pPr>
+        <w:spacing w:before="0" w:after="0" w:line="240" w:lineRule="auto"/>
+        <w:ind w:left="113"/>
+        <w:jc w:val="left"/>
+        <w:shd w:val="clear" w:fill="F2F2F2"/>
+      </w:pPr>
+      <w:r>
+        <w:rPr>
+          <w:rFonts w:ascii="Consolas" w:hAnsi="Consolas"/>
+          <w:sz w:val="17"/>
+        </w:rPr>
+        <w:t xml:space="preserve"> </w:t>
+      </w:r>
+    </w:p>
+    <w:p>
+      <w:pPr>
+        <w:spacing w:before="0" w:after="0" w:line="240" w:lineRule="auto"/>
+        <w:ind w:left="113"/>
+        <w:jc w:val="left"/>
+        <w:shd w:val="clear" w:fill="F2F2F2"/>
+      </w:pPr>
+      <w:r>
+        <w:rPr>
+          <w:rFonts w:ascii="Consolas" w:hAnsi="Consolas"/>
+          <w:sz w:val="17"/>
+        </w:rPr>
+        <w:t># 5. validacao em dados reais. --quick (minutos) para sanidade; sem flag para o completo (~1 h)</w:t>
+      </w:r>
+    </w:p>
+    <w:p>
+      <w:pPr>
+        <w:spacing w:before="0" w:after="0" w:line="240" w:lineRule="auto"/>
+        <w:ind w:left="113"/>
+        <w:jc w:val="left"/>
+        <w:shd w:val="clear" w:fill="F2F2F2"/>
+      </w:pPr>
+      <w:r>
+        <w:rPr>
+          <w:rFonts w:ascii="Consolas" w:hAnsi="Consolas"/>
+          <w:sz w:val="17"/>
+        </w:rPr>
+        <w:t>python benchmark.py --quick</w:t>
+      </w:r>
+    </w:p>
+    <w:p>
+      <w:pPr>
+        <w:spacing w:before="0" w:after="0" w:line="240" w:lineRule="auto"/>
+        <w:ind w:left="113"/>
+        <w:jc w:val="left"/>
+        <w:shd w:val="clear" w:fill="F2F2F2"/>
+      </w:pPr>
+      <w:r>
+        <w:rPr>
+          <w:rFonts w:ascii="Consolas" w:hAnsi="Consolas"/>
+          <w:sz w:val="17"/>
+        </w:rPr>
+        <w:t>python benchmark.py            # gera resultados_reais.json e cross_domain.json</w:t>
+      </w:r>
+    </w:p>
+    <w:p>
+      <w:pPr>
+        <w:spacing w:before="0" w:after="0" w:line="240" w:lineRule="auto"/>
+        <w:ind w:left="113"/>
+        <w:jc w:val="left"/>
+        <w:shd w:val="clear" w:fill="F2F2F2"/>
+      </w:pPr>
+      <w:r>
+        <w:rPr>
+          <w:rFonts w:ascii="Consolas" w:hAnsi="Consolas"/>
+          <w:sz w:val="17"/>
+        </w:rPr>
+        <w:t xml:space="preserve"> </w:t>
+      </w:r>
+    </w:p>
+    <w:p>
+      <w:pPr>
+        <w:spacing w:before="0" w:after="0" w:line="240" w:lineRule="auto"/>
+        <w:ind w:left="113"/>
+        <w:jc w:val="left"/>
+        <w:shd w:val="clear" w:fill="F2F2F2"/>
+      </w:pPr>
+      <w:r>
+        <w:rPr>
+          <w:rFonts w:ascii="Consolas" w:hAnsi="Consolas"/>
+          <w:sz w:val="17"/>
+        </w:rPr>
+        <w:t># 6. regenerar o artigo e esta documentacao a partir dos resultados</w:t>
+      </w:r>
+    </w:p>
+    <w:p>
+      <w:pPr>
+        <w:spacing w:before="0" w:after="0" w:line="240" w:lineRule="auto"/>
+        <w:ind w:left="113"/>
+        <w:jc w:val="left"/>
+        <w:shd w:val="clear" w:fill="F2F2F2"/>
+      </w:pPr>
+      <w:r>
+        <w:rPr>
+          <w:rFonts w:ascii="Consolas" w:hAnsi="Consolas"/>
+          <w:sz w:val="17"/>
+        </w:rPr>
+        <w:t>python gen_artigo.py</w:t>
+      </w:r>
+    </w:p>
+    <w:p>
+      <w:pPr>
+        <w:spacing w:before="0" w:after="0" w:line="240" w:lineRule="auto"/>
+        <w:ind w:left="113"/>
+        <w:jc w:val="left"/>
+        <w:shd w:val="clear" w:fill="F2F2F2"/>
+      </w:pPr>
+      <w:r>
+        <w:rPr>
+          <w:rFonts w:ascii="Consolas" w:hAnsi="Consolas"/>
+          <w:sz w:val="17"/>
+        </w:rPr>
         <w:t>python gen_doc.py</w:t>
       </w:r>
     </w:p>
@@ -6190,7 +6353,35 @@
           <w:i w:val="0"/>
           <w:sz w:val="22"/>
         </w:rPr>
-        <w:t>Por usar sementes fixas e ferramentas de versão conhecida, a execução reproduz os números das tabelas da Seção 11 dentro da variação esperada de medição de tempo.</w:t>
+        <w:t>Por usar sementes fixas e ferramentas de versão conhecida, a execução reproduz os números das tabelas da Seção 11 dentro da variação esperada de medição de tempo. O modo --quick grava em arquivos separados, para não sobrescrever os resultados canônicos.</w:t>
+      </w:r>
+    </w:p>
+    <w:p>
+      <w:pPr>
+        <w:pStyle w:val="Heading2"/>
+      </w:pPr>
+      <w:r>
+        <w:rPr>
+          <w:rFonts w:ascii="Times New Roman" w:hAnsi="Times New Roman"/>
+          <w:b/>
+          <w:color w:val="000000"/>
+        </w:rPr>
+        <w:t>10.6. Decisões metodológicas e seu porquê</w:t>
+      </w:r>
+    </w:p>
+    <w:p>
+      <w:pPr>
+        <w:spacing w:before="0" w:after="120"/>
+        <w:jc w:val="both"/>
+      </w:pPr>
+      <w:r>
+        <w:rPr>
+          <w:rFonts w:ascii="Times New Roman" w:hAnsi="Times New Roman"/>
+          <w:b w:val="0"/>
+          <w:i w:val="0"/>
+          <w:sz w:val="22"/>
+        </w:rPr>
+        <w:t>Várias escolhas do protocolo existem para garantir rigor, e convém explicitá-las. A medição por mensagem, e não por arquivo inteiro, isola o efeito do prior na partida a frio, que é justamente o que o método corrige; medir arquivos diluiria esse efeito. A separação held-out, com o primer construído apenas a partir do treino, impede que a avaliação meça memorização em vez de generalização. A comparação contra a variante enxuta do zstd separa o ganho atribuível ao modelo do ganho atribuível ao formato sem cabeçalho, evitando creditar ao modelo uma vantagem que é, em parte, de enquadramento. A inclusão dos especialistas de string curta, Unishox2 e SMAZ, situa o método ante seus concorrentes mais diretos no nicho, e não apenas ante compressores de uso geral. O experimento cruzado quantifica a dependência de domínio, que é a principal ameaça à validade. E o uso de mil mensagens por domínio, com a mediana e o percentil 95 além da média, garante que o resultado não reflita poucos casos extremos. Cada uma dessas decisões responde a uma pergunta que um avaliador atento faria.</w:t>
       </w:r>
     </w:p>
     <w:p>
@@ -14207,7 +14398,318 @@
           <w:b/>
           <w:color w:val="000000"/>
         </w:rPr>
-        <w:t>12.4. Energia e airtime</w:t>
+        <w:t>12.4. Verificação de corretude no PC</w:t>
+      </w:r>
+    </w:p>
+    <w:p>
+      <w:pPr>
+        <w:spacing w:before="0" w:after="120"/>
+        <w:jc w:val="both"/>
+      </w:pPr>
+      <w:r>
+        <w:rPr>
+          <w:rFonts w:ascii="Times New Roman" w:hAnsi="Times New Roman"/>
+          <w:b w:val="0"/>
+          <w:i w:val="0"/>
+          <w:sz w:val="22"/>
+        </w:rPr>
+        <w:t>Antes de levar o decoder ao dispositivo, convém confirmar no computador que ele reproduz exatamente a saída do motor Rust. O repositório traz um driver de teste, embedded/test/host_test.c, que lê um arquivo .gpa e o descomprime com o decoder em C. O procedimento é compilar o driver com o gcc e, para cada caso, comprimir com o main.exe e descomprimir com o binário em C, comparando byte a byte.</w:t>
+      </w:r>
+    </w:p>
+    <w:p>
+      <w:pPr>
+        <w:spacing w:before="0" w:after="0" w:line="240" w:lineRule="auto"/>
+        <w:ind w:left="113"/>
+        <w:jc w:val="left"/>
+        <w:shd w:val="clear" w:fill="F2F2F2"/>
+      </w:pPr>
+      <w:r>
+        <w:rPr>
+          <w:rFonts w:ascii="Consolas" w:hAnsi="Consolas"/>
+          <w:sz w:val="17"/>
+        </w:rPr>
+        <w:t>cd embedded/test</w:t>
+      </w:r>
+    </w:p>
+    <w:p>
+      <w:pPr>
+        <w:spacing w:before="0" w:after="0" w:line="240" w:lineRule="auto"/>
+        <w:ind w:left="113"/>
+        <w:jc w:val="left"/>
+        <w:shd w:val="clear" w:fill="F2F2F2"/>
+      </w:pPr>
+      <w:r>
+        <w:rPr>
+          <w:rFonts w:ascii="Consolas" w:hAnsi="Consolas"/>
+          <w:sz w:val="17"/>
+        </w:rPr>
+        <w:t>gcc -O2 -DGPA_ENABLE_PRIMED -I ../components/gpa_decoder/include \</w:t>
+      </w:r>
+    </w:p>
+    <w:p>
+      <w:pPr>
+        <w:spacing w:before="0" w:after="0" w:line="240" w:lineRule="auto"/>
+        <w:ind w:left="113"/>
+        <w:jc w:val="left"/>
+        <w:shd w:val="clear" w:fill="F2F2F2"/>
+      </w:pPr>
+      <w:r>
+        <w:rPr>
+          <w:rFonts w:ascii="Consolas" w:hAnsi="Consolas"/>
+          <w:sz w:val="17"/>
+        </w:rPr>
+        <w:t xml:space="preserve">    ../components/gpa_decoder/gpa_decoder.c host_test.c -o gpa_host.exe</w:t>
+      </w:r>
+    </w:p>
+    <w:p>
+      <w:pPr>
+        <w:spacing w:before="0" w:after="0" w:line="240" w:lineRule="auto"/>
+        <w:ind w:left="113"/>
+        <w:jc w:val="left"/>
+        <w:shd w:val="clear" w:fill="F2F2F2"/>
+      </w:pPr>
+      <w:r>
+        <w:rPr>
+          <w:rFonts w:ascii="Consolas" w:hAnsi="Consolas"/>
+          <w:sz w:val="17"/>
+        </w:rPr>
+        <w:t xml:space="preserve"> </w:t>
+      </w:r>
+    </w:p>
+    <w:p>
+      <w:pPr>
+        <w:spacing w:before="0" w:after="0" w:line="240" w:lineRule="auto"/>
+        <w:ind w:left="113"/>
+        <w:jc w:val="left"/>
+        <w:shd w:val="clear" w:fill="F2F2F2"/>
+      </w:pPr>
+      <w:r>
+        <w:rPr>
+          <w:rFonts w:ascii="Consolas" w:hAnsi="Consolas"/>
+          <w:sz w:val="17"/>
+        </w:rPr>
+        <w:t># modo normal: comprime com o motor Rust, descomprime com o C, compara</w:t>
+      </w:r>
+    </w:p>
+    <w:p>
+      <w:pPr>
+        <w:spacing w:before="0" w:after="0" w:line="240" w:lineRule="auto"/>
+        <w:ind w:left="113"/>
+        <w:jc w:val="left"/>
+        <w:shd w:val="clear" w:fill="F2F2F2"/>
+      </w:pPr>
+      <w:r>
+        <w:rPr>
+          <w:rFonts w:ascii="Consolas" w:hAnsi="Consolas"/>
+          <w:sz w:val="17"/>
+        </w:rPr>
+        <w:t>main.exe c   mensagem  m.gpa          &amp;&amp;  gpa_host m.gpa  saida</w:t>
+      </w:r>
+    </w:p>
+    <w:p>
+      <w:pPr>
+        <w:spacing w:before="0" w:after="0" w:line="240" w:lineRule="auto"/>
+        <w:ind w:left="113"/>
+        <w:jc w:val="left"/>
+        <w:shd w:val="clear" w:fill="F2F2F2"/>
+      </w:pPr>
+      <w:r>
+        <w:rPr>
+          <w:rFonts w:ascii="Consolas" w:hAnsi="Consolas"/>
+          <w:sz w:val="17"/>
+        </w:rPr>
+        <w:t># modo com prior: o mesmo primer dos dois lados</w:t>
+      </w:r>
+    </w:p>
+    <w:p>
+      <w:pPr>
+        <w:spacing w:before="0" w:after="0" w:line="240" w:lineRule="auto"/>
+        <w:ind w:left="113"/>
+        <w:jc w:val="left"/>
+        <w:shd w:val="clear" w:fill="F2F2F2"/>
+      </w:pPr>
+      <w:r>
+        <w:rPr>
+          <w:rFonts w:ascii="Consolas" w:hAnsi="Consolas"/>
+          <w:sz w:val="17"/>
+        </w:rPr>
+        <w:t>main.exe cpf mensagem  m.gpa primer.bin  &amp;&amp;  gpa_host m.gpa saida primer.bin</w:t>
+      </w:r>
+    </w:p>
+    <w:p>
+      <w:pPr>
+        <w:spacing w:before="0" w:after="120"/>
+        <w:jc w:val="both"/>
+      </w:pPr>
+      <w:r>
+        <w:rPr>
+          <w:rFonts w:ascii="Times New Roman" w:hAnsi="Times New Roman"/>
+          <w:b w:val="0"/>
+          <w:i w:val="0"/>
+          <w:sz w:val="22"/>
+        </w:rPr>
+        <w:t>Nos vetores de conformidade e em mensagens reais de diferentes domínios, em modo normal e com prior, o decoder em C reproduziu a saída do motor de referência em doze de doze casos, bit a bit, incluindo o dado incompressível, em que o modo de armazenamento é exercido. É essa equivalência que autoriza usar o binário em C como decoder de produção no dispositivo: o formato não tem número de versão, então a compatibilidade entre as duas implementações depende da reprodução exata de cada modelo e do codificador, e a suíte de testes é a especificação operacional dessa compatibilidade.</w:t>
+      </w:r>
+    </w:p>
+    <w:p>
+      <w:pPr>
+        <w:pStyle w:val="Heading2"/>
+      </w:pPr>
+      <w:r>
+        <w:rPr>
+          <w:rFonts w:ascii="Times New Roman" w:hAnsi="Times New Roman"/>
+          <w:b/>
+          <w:color w:val="000000"/>
+        </w:rPr>
+        <w:t>12.5. Reprodução no ESP-IDF</w:t>
+      </w:r>
+    </w:p>
+    <w:p>
+      <w:pPr>
+        <w:spacing w:before="0" w:after="120"/>
+        <w:jc w:val="both"/>
+      </w:pPr>
+      <w:r>
+        <w:rPr>
+          <w:rFonts w:ascii="Times New Roman" w:hAnsi="Times New Roman"/>
+          <w:b w:val="0"/>
+          <w:i w:val="0"/>
+          <w:sz w:val="22"/>
+        </w:rPr>
+        <w:t>Para medir o footprint no alvo e ver o decoder executar, usa-se o ESP-IDF. No Windows, a instalação é feita pelo instalador oficial, que traz o compilador xtensa, o idf.py e um Python próprio, e cria um atalho de terminal com o ambiente já ativado. A partir desse terminal, dentro de embedded, a medição do footprint é direta e não exige o dispositivo nem o emulador:</w:t>
+      </w:r>
+    </w:p>
+    <w:p>
+      <w:pPr>
+        <w:spacing w:before="0" w:after="0" w:line="240" w:lineRule="auto"/>
+        <w:ind w:left="113"/>
+        <w:jc w:val="left"/>
+        <w:shd w:val="clear" w:fill="F2F2F2"/>
+      </w:pPr>
+      <w:r>
+        <w:rPr>
+          <w:rFonts w:ascii="Consolas" w:hAnsi="Consolas"/>
+          <w:sz w:val="17"/>
+        </w:rPr>
+        <w:t>idf.py set-target esp32</w:t>
+      </w:r>
+    </w:p>
+    <w:p>
+      <w:pPr>
+        <w:spacing w:before="0" w:after="0" w:line="240" w:lineRule="auto"/>
+        <w:ind w:left="113"/>
+        <w:jc w:val="left"/>
+        <w:shd w:val="clear" w:fill="F2F2F2"/>
+      </w:pPr>
+      <w:r>
+        <w:rPr>
+          <w:rFonts w:ascii="Consolas" w:hAnsi="Consolas"/>
+          <w:sz w:val="17"/>
+        </w:rPr>
+        <w:t>idf.py build</w:t>
+      </w:r>
+    </w:p>
+    <w:p>
+      <w:pPr>
+        <w:spacing w:before="0" w:after="0" w:line="240" w:lineRule="auto"/>
+        <w:ind w:left="113"/>
+        <w:jc w:val="left"/>
+        <w:shd w:val="clear" w:fill="F2F2F2"/>
+      </w:pPr>
+      <w:r>
+        <w:rPr>
+          <w:rFonts w:ascii="Consolas" w:hAnsi="Consolas"/>
+          <w:sz w:val="17"/>
+        </w:rPr>
+        <w:t>idf.py size              # resumo de uso de memoria do firmware inteiro</w:t>
+      </w:r>
+    </w:p>
+    <w:p>
+      <w:pPr>
+        <w:spacing w:before="0" w:after="0" w:line="240" w:lineRule="auto"/>
+        <w:ind w:left="113"/>
+        <w:jc w:val="left"/>
+        <w:shd w:val="clear" w:fill="F2F2F2"/>
+      </w:pPr>
+      <w:r>
+        <w:rPr>
+          <w:rFonts w:ascii="Consolas" w:hAnsi="Consolas"/>
+          <w:sz w:val="17"/>
+        </w:rPr>
+        <w:t>idf.py size-components   # contribuicao por componente; ver a linha gpa_decoder</w:t>
+      </w:r>
+    </w:p>
+    <w:p>
+      <w:pPr>
+        <w:spacing w:before="0" w:after="120"/>
+        <w:jc w:val="both"/>
+      </w:pPr>
+      <w:r>
+        <w:rPr>
+          <w:rFonts w:ascii="Times New Roman" w:hAnsi="Times New Roman"/>
+          <w:b w:val="0"/>
+          <w:i w:val="0"/>
+          <w:sz w:val="22"/>
+        </w:rPr>
+        <w:t>Na medição usada nesta documentação, o componente gpa_decoder apareceu com 19.692 bytes de .bss, 1.811 bytes de .text em flash e 220 bytes de .rodata, no alvo xtensa, exatamente os valores da Tabela 11. Para executar o decoder no emulador, instala-se o QEMU da Espressif e roda-se o monitor:</w:t>
+      </w:r>
+    </w:p>
+    <w:p>
+      <w:pPr>
+        <w:spacing w:before="0" w:after="0" w:line="240" w:lineRule="auto"/>
+        <w:ind w:left="113"/>
+        <w:jc w:val="left"/>
+        <w:shd w:val="clear" w:fill="F2F2F2"/>
+      </w:pPr>
+      <w:r>
+        <w:rPr>
+          <w:rFonts w:ascii="Consolas" w:hAnsi="Consolas"/>
+          <w:sz w:val="17"/>
+        </w:rPr>
+        <w:t>python %IDF_PATH%\tools\idf_tools.py install qemu-xtensa   # uma vez; reabrir o terminal depois</w:t>
+      </w:r>
+    </w:p>
+    <w:p>
+      <w:pPr>
+        <w:spacing w:before="0" w:after="0" w:line="240" w:lineRule="auto"/>
+        <w:ind w:left="113"/>
+        <w:jc w:val="left"/>
+        <w:shd w:val="clear" w:fill="F2F2F2"/>
+      </w:pPr>
+      <w:r>
+        <w:rPr>
+          <w:rFonts w:ascii="Consolas" w:hAnsi="Consolas"/>
+          <w:sz w:val="17"/>
+        </w:rPr>
+        <w:t>idf.py qemu monitor      # boot do ESP32 emulado; imprime o app_main; sair com Ctrl+]</w:t>
+      </w:r>
+    </w:p>
+    <w:p>
+      <w:pPr>
+        <w:spacing w:before="0" w:after="120"/>
+        <w:jc w:val="both"/>
+      </w:pPr>
+      <w:r>
+        <w:rPr>
+          <w:rFonts w:ascii="Times New Roman" w:hAnsi="Times New Roman"/>
+          <w:b w:val="0"/>
+          <w:i w:val="0"/>
+          <w:sz w:val="22"/>
+        </w:rPr>
+        <w:t>O exemplo descomprime uma mensagem embutida, confere o round-trip bit a bit e imprime a latência, por esp_timer_get_time, e o heap livre antes e depois, por heap_caps_get_free_size. Como o decoder não aloca dinamicamente, o delta de heap é nulo, e todo o consumo aparece no .bss, já visível pelo idf.py size. Convém lembrar que a latência reportada pelo QEMU é indicativa, pois o emulador não é fiel ao ciclo do silício; a latência e a energia reais exigem a placa física, e ficam como medição futura sem alterar as conclusões de footprint.</w:t>
+      </w:r>
+    </w:p>
+    <w:p>
+      <w:pPr>
+        <w:pStyle w:val="Heading2"/>
+      </w:pPr>
+      <w:r>
+        <w:rPr>
+          <w:rFonts w:ascii="Times New Roman" w:hAnsi="Times New Roman"/>
+          <w:b/>
+          <w:color w:val="000000"/>
+        </w:rPr>
+        <w:t>12.6. Energia e airtime</w:t>
       </w:r>
     </w:p>
     <w:p>
@@ -16849,6 +17351,865 @@
           <w:sz w:val="22"/>
         </w:rPr>
         <w:t>O critério de sucesso é a suíte de conformidade da Tabela B.1: round-trip exato e os mesmos tamanhos de referência. Como o formato não tem cabeçalho nem número de versão, a compatibilidade entre implementações depende da reprodução exata de cada modelo e do codificador, o que torna a suíte de conformidade a especificação operacional do formato.</w:t>
+      </w:r>
+    </w:p>
+    <w:p>
+      <w:pPr>
+        <w:pStyle w:val="Heading1"/>
+      </w:pPr>
+      <w:r>
+        <w:rPr>
+          <w:rFonts w:ascii="Times New Roman" w:hAnsi="Times New Roman"/>
+          <w:b/>
+          <w:color w:val="000000"/>
+        </w:rPr>
+        <w:t>Apêndice D. Ambiente e versões</w:t>
+      </w:r>
+    </w:p>
+    <w:p>
+      <w:pPr>
+        <w:spacing w:before="0" w:after="120"/>
+        <w:jc w:val="both"/>
+      </w:pPr>
+      <w:r>
+        <w:rPr>
+          <w:rFonts w:ascii="Times New Roman" w:hAnsi="Times New Roman"/>
+          <w:b w:val="0"/>
+          <w:i w:val="0"/>
+          <w:sz w:val="22"/>
+        </w:rPr>
+        <w:t>Para reprodução fiel, a Tabela D.1 lista as ferramentas e versões utilizadas. As versões dos compressores afetam os tamanhos de saída; as do compilador e do ESP-IDF afetam o footprint. As sementes fixas dos scripts tornam os resultados estáveis entre execuções.</w:t>
+      </w:r>
+    </w:p>
+    <w:p>
+      <w:pPr>
+        <w:spacing w:before="120" w:after="80"/>
+        <w:jc w:val="center"/>
+      </w:pPr>
+      <w:r>
+        <w:rPr>
+          <w:rFonts w:ascii="Arial" w:hAnsi="Arial"/>
+          <w:b/>
+          <w:i w:val="0"/>
+          <w:sz w:val="19"/>
+        </w:rPr>
+        <w:t>Tabela D.1. Ferramentas e versões.</w:t>
+      </w:r>
+    </w:p>
+    <w:tbl>
+      <w:tblPr>
+        <w:tblStyle w:val="TableGrid"/>
+        <w:tblW w:type="auto" w:w="0"/>
+        <w:jc w:val="center"/>
+        <w:tblLook w:firstColumn="1" w:firstRow="1" w:lastColumn="0" w:lastRow="0" w:noHBand="0" w:noVBand="1" w:val="04A0"/>
+      </w:tblPr>
+      <w:tblGrid>
+        <w:gridCol w:w="2986"/>
+        <w:gridCol w:w="2986"/>
+        <w:gridCol w:w="2986"/>
+      </w:tblGrid>
+      <w:tr>
+        <w:tc>
+          <w:tcPr>
+            <w:tcW w:type="dxa" w:w="2986"/>
+          </w:tcPr>
+          <w:p>
+            <w:pPr>
+              <w:jc w:val="center"/>
+            </w:pPr>
+            <w:r/>
+            <w:r>
+              <w:rPr>
+                <w:rFonts w:ascii="Times New Roman" w:hAnsi="Times New Roman"/>
+                <w:b/>
+                <w:sz w:val="19"/>
+              </w:rPr>
+              <w:t>Ferramenta</w:t>
+            </w:r>
+          </w:p>
+        </w:tc>
+        <w:tc>
+          <w:tcPr>
+            <w:tcW w:type="dxa" w:w="2986"/>
+          </w:tcPr>
+          <w:p>
+            <w:pPr>
+              <w:jc w:val="center"/>
+            </w:pPr>
+            <w:r/>
+            <w:r>
+              <w:rPr>
+                <w:rFonts w:ascii="Times New Roman" w:hAnsi="Times New Roman"/>
+                <w:b/>
+                <w:sz w:val="19"/>
+              </w:rPr>
+              <w:t>Versão / configuração</w:t>
+            </w:r>
+          </w:p>
+        </w:tc>
+        <w:tc>
+          <w:tcPr>
+            <w:tcW w:type="dxa" w:w="2986"/>
+          </w:tcPr>
+          <w:p>
+            <w:pPr>
+              <w:jc w:val="center"/>
+            </w:pPr>
+            <w:r/>
+            <w:r>
+              <w:rPr>
+                <w:rFonts w:ascii="Times New Roman" w:hAnsi="Times New Roman"/>
+                <w:b/>
+                <w:sz w:val="19"/>
+              </w:rPr>
+              <w:t>Uso</w:t>
+            </w:r>
+          </w:p>
+        </w:tc>
+      </w:tr>
+      <w:tr>
+        <w:tc>
+          <w:tcPr>
+            <w:tcW w:type="dxa" w:w="2986"/>
+          </w:tcPr>
+          <w:p>
+            <w:pPr>
+              <w:jc w:val="left"/>
+            </w:pPr>
+            <w:r/>
+            <w:r>
+              <w:rPr>
+                <w:rFonts w:ascii="Times New Roman" w:hAnsi="Times New Roman"/>
+                <w:sz w:val="19"/>
+              </w:rPr>
+              <w:t>Rust (rustc)</w:t>
+            </w:r>
+          </w:p>
+        </w:tc>
+        <w:tc>
+          <w:tcPr>
+            <w:tcW w:type="dxa" w:w="2986"/>
+          </w:tcPr>
+          <w:p>
+            <w:pPr>
+              <w:jc w:val="center"/>
+            </w:pPr>
+            <w:r/>
+            <w:r>
+              <w:rPr>
+                <w:rFonts w:ascii="Times New Roman" w:hAnsi="Times New Roman"/>
+                <w:sz w:val="19"/>
+              </w:rPr>
+              <w:t>stable, alvo x86_64-pc-windows-gnu</w:t>
+            </w:r>
+          </w:p>
+        </w:tc>
+        <w:tc>
+          <w:tcPr>
+            <w:tcW w:type="dxa" w:w="2986"/>
+          </w:tcPr>
+          <w:p>
+            <w:pPr>
+              <w:jc w:val="center"/>
+            </w:pPr>
+            <w:r/>
+            <w:r>
+              <w:rPr>
+                <w:rFonts w:ascii="Times New Roman" w:hAnsi="Times New Roman"/>
+                <w:sz w:val="19"/>
+              </w:rPr>
+              <w:t>compilar o motor (o ligador MSVC falha)</w:t>
+            </w:r>
+          </w:p>
+        </w:tc>
+      </w:tr>
+      <w:tr>
+        <w:tc>
+          <w:tcPr>
+            <w:tcW w:type="dxa" w:w="2986"/>
+          </w:tcPr>
+          <w:p>
+            <w:pPr>
+              <w:jc w:val="left"/>
+            </w:pPr>
+            <w:r/>
+            <w:r>
+              <w:rPr>
+                <w:rFonts w:ascii="Times New Roman" w:hAnsi="Times New Roman"/>
+                <w:sz w:val="19"/>
+              </w:rPr>
+              <w:t>gcc</w:t>
+            </w:r>
+          </w:p>
+        </w:tc>
+        <w:tc>
+          <w:tcPr>
+            <w:tcW w:type="dxa" w:w="2986"/>
+          </w:tcPr>
+          <w:p>
+            <w:pPr>
+              <w:jc w:val="center"/>
+            </w:pPr>
+            <w:r/>
+            <w:r>
+              <w:rPr>
+                <w:rFonts w:ascii="Times New Roman" w:hAnsi="Times New Roman"/>
+                <w:sz w:val="19"/>
+              </w:rPr>
+              <w:t>MinGW-w64 / msys2</w:t>
+            </w:r>
+          </w:p>
+        </w:tc>
+        <w:tc>
+          <w:tcPr>
+            <w:tcW w:type="dxa" w:w="2986"/>
+          </w:tcPr>
+          <w:p>
+            <w:pPr>
+              <w:jc w:val="center"/>
+            </w:pPr>
+            <w:r/>
+            <w:r>
+              <w:rPr>
+                <w:rFonts w:ascii="Times New Roman" w:hAnsi="Times New Roman"/>
+                <w:sz w:val="19"/>
+              </w:rPr>
+              <w:t>baselines Unishox2 e SMAZ; decoder C no host</w:t>
+            </w:r>
+          </w:p>
+        </w:tc>
+      </w:tr>
+      <w:tr>
+        <w:tc>
+          <w:tcPr>
+            <w:tcW w:type="dxa" w:w="2986"/>
+          </w:tcPr>
+          <w:p>
+            <w:pPr>
+              <w:jc w:val="left"/>
+            </w:pPr>
+            <w:r/>
+            <w:r>
+              <w:rPr>
+                <w:rFonts w:ascii="Times New Roman" w:hAnsi="Times New Roman"/>
+                <w:sz w:val="19"/>
+              </w:rPr>
+              <w:t>zstd</w:t>
+            </w:r>
+          </w:p>
+        </w:tc>
+        <w:tc>
+          <w:tcPr>
+            <w:tcW w:type="dxa" w:w="2986"/>
+          </w:tcPr>
+          <w:p>
+            <w:pPr>
+              <w:jc w:val="center"/>
+            </w:pPr>
+            <w:r/>
+            <w:r>
+              <w:rPr>
+                <w:rFonts w:ascii="Times New Roman" w:hAnsi="Times New Roman"/>
+                <w:sz w:val="19"/>
+              </w:rPr>
+              <w:t>1.5.7</w:t>
+            </w:r>
+          </w:p>
+        </w:tc>
+        <w:tc>
+          <w:tcPr>
+            <w:tcW w:type="dxa" w:w="2986"/>
+          </w:tcPr>
+          <w:p>
+            <w:pPr>
+              <w:jc w:val="center"/>
+            </w:pPr>
+            <w:r/>
+            <w:r>
+              <w:rPr>
+                <w:rFonts w:ascii="Times New Roman" w:hAnsi="Times New Roman"/>
+                <w:sz w:val="19"/>
+              </w:rPr>
+              <w:t>baseline, com e sem dicionário; dicionário treinado por --train</w:t>
+            </w:r>
+          </w:p>
+        </w:tc>
+      </w:tr>
+      <w:tr>
+        <w:tc>
+          <w:tcPr>
+            <w:tcW w:type="dxa" w:w="2986"/>
+          </w:tcPr>
+          <w:p>
+            <w:pPr>
+              <w:jc w:val="left"/>
+            </w:pPr>
+            <w:r/>
+            <w:r>
+              <w:rPr>
+                <w:rFonts w:ascii="Times New Roman" w:hAnsi="Times New Roman"/>
+                <w:sz w:val="19"/>
+              </w:rPr>
+              <w:t>xz</w:t>
+            </w:r>
+          </w:p>
+        </w:tc>
+        <w:tc>
+          <w:tcPr>
+            <w:tcW w:type="dxa" w:w="2986"/>
+          </w:tcPr>
+          <w:p>
+            <w:pPr>
+              <w:jc w:val="center"/>
+            </w:pPr>
+            <w:r/>
+            <w:r>
+              <w:rPr>
+                <w:rFonts w:ascii="Times New Roman" w:hAnsi="Times New Roman"/>
+                <w:sz w:val="19"/>
+              </w:rPr>
+              <w:t>5.6.3</w:t>
+            </w:r>
+          </w:p>
+        </w:tc>
+        <w:tc>
+          <w:tcPr>
+            <w:tcW w:type="dxa" w:w="2986"/>
+          </w:tcPr>
+          <w:p>
+            <w:pPr>
+              <w:jc w:val="center"/>
+            </w:pPr>
+            <w:r/>
+            <w:r>
+              <w:rPr>
+                <w:rFonts w:ascii="Times New Roman" w:hAnsi="Times New Roman"/>
+                <w:sz w:val="19"/>
+              </w:rPr>
+              <w:t>baseline</w:t>
+            </w:r>
+          </w:p>
+        </w:tc>
+      </w:tr>
+      <w:tr>
+        <w:tc>
+          <w:tcPr>
+            <w:tcW w:type="dxa" w:w="2986"/>
+          </w:tcPr>
+          <w:p>
+            <w:pPr>
+              <w:jc w:val="left"/>
+            </w:pPr>
+            <w:r/>
+            <w:r>
+              <w:rPr>
+                <w:rFonts w:ascii="Times New Roman" w:hAnsi="Times New Roman"/>
+                <w:sz w:val="19"/>
+              </w:rPr>
+              <w:t>gzip</w:t>
+            </w:r>
+          </w:p>
+        </w:tc>
+        <w:tc>
+          <w:tcPr>
+            <w:tcW w:type="dxa" w:w="2986"/>
+          </w:tcPr>
+          <w:p>
+            <w:pPr>
+              <w:jc w:val="center"/>
+            </w:pPr>
+            <w:r/>
+            <w:r>
+              <w:rPr>
+                <w:rFonts w:ascii="Times New Roman" w:hAnsi="Times New Roman"/>
+                <w:sz w:val="19"/>
+              </w:rPr>
+              <w:t>1.13</w:t>
+            </w:r>
+          </w:p>
+        </w:tc>
+        <w:tc>
+          <w:tcPr>
+            <w:tcW w:type="dxa" w:w="2986"/>
+          </w:tcPr>
+          <w:p>
+            <w:pPr>
+              <w:jc w:val="center"/>
+            </w:pPr>
+            <w:r/>
+            <w:r>
+              <w:rPr>
+                <w:rFonts w:ascii="Times New Roman" w:hAnsi="Times New Roman"/>
+                <w:sz w:val="19"/>
+              </w:rPr>
+              <w:t>baseline</w:t>
+            </w:r>
+          </w:p>
+        </w:tc>
+      </w:tr>
+      <w:tr>
+        <w:tc>
+          <w:tcPr>
+            <w:tcW w:type="dxa" w:w="2986"/>
+          </w:tcPr>
+          <w:p>
+            <w:pPr>
+              <w:jc w:val="left"/>
+            </w:pPr>
+            <w:r/>
+            <w:r>
+              <w:rPr>
+                <w:rFonts w:ascii="Times New Roman" w:hAnsi="Times New Roman"/>
+                <w:sz w:val="19"/>
+              </w:rPr>
+              <w:t>brotli</w:t>
+            </w:r>
+          </w:p>
+        </w:tc>
+        <w:tc>
+          <w:tcPr>
+            <w:tcW w:type="dxa" w:w="2986"/>
+          </w:tcPr>
+          <w:p>
+            <w:pPr>
+              <w:jc w:val="center"/>
+            </w:pPr>
+            <w:r/>
+            <w:r>
+              <w:rPr>
+                <w:rFonts w:ascii="Times New Roman" w:hAnsi="Times New Roman"/>
+                <w:sz w:val="19"/>
+              </w:rPr>
+              <w:t>1.1.0</w:t>
+            </w:r>
+          </w:p>
+        </w:tc>
+        <w:tc>
+          <w:tcPr>
+            <w:tcW w:type="dxa" w:w="2986"/>
+          </w:tcPr>
+          <w:p>
+            <w:pPr>
+              <w:jc w:val="center"/>
+            </w:pPr>
+            <w:r/>
+            <w:r>
+              <w:rPr>
+                <w:rFonts w:ascii="Times New Roman" w:hAnsi="Times New Roman"/>
+                <w:sz w:val="19"/>
+              </w:rPr>
+              <w:t>baseline</w:t>
+            </w:r>
+          </w:p>
+        </w:tc>
+      </w:tr>
+      <w:tr>
+        <w:tc>
+          <w:tcPr>
+            <w:tcW w:type="dxa" w:w="2986"/>
+          </w:tcPr>
+          <w:p>
+            <w:pPr>
+              <w:jc w:val="left"/>
+            </w:pPr>
+            <w:r/>
+            <w:r>
+              <w:rPr>
+                <w:rFonts w:ascii="Times New Roman" w:hAnsi="Times New Roman"/>
+                <w:sz w:val="19"/>
+              </w:rPr>
+              <w:t>Unishox2 / SMAZ</w:t>
+            </w:r>
+          </w:p>
+        </w:tc>
+        <w:tc>
+          <w:tcPr>
+            <w:tcW w:type="dxa" w:w="2986"/>
+          </w:tcPr>
+          <w:p>
+            <w:pPr>
+              <w:jc w:val="center"/>
+            </w:pPr>
+            <w:r/>
+            <w:r>
+              <w:rPr>
+                <w:rFonts w:ascii="Times New Roman" w:hAnsi="Times New Roman"/>
+                <w:sz w:val="19"/>
+              </w:rPr>
+              <w:t>fonte oficial (compilado)</w:t>
+            </w:r>
+          </w:p>
+        </w:tc>
+        <w:tc>
+          <w:tcPr>
+            <w:tcW w:type="dxa" w:w="2986"/>
+          </w:tcPr>
+          <w:p>
+            <w:pPr>
+              <w:jc w:val="center"/>
+            </w:pPr>
+            <w:r/>
+            <w:r>
+              <w:rPr>
+                <w:rFonts w:ascii="Times New Roman" w:hAnsi="Times New Roman"/>
+                <w:sz w:val="19"/>
+              </w:rPr>
+              <w:t>especialistas de string curta</w:t>
+            </w:r>
+          </w:p>
+        </w:tc>
+      </w:tr>
+      <w:tr>
+        <w:tc>
+          <w:tcPr>
+            <w:tcW w:type="dxa" w:w="2986"/>
+          </w:tcPr>
+          <w:p>
+            <w:pPr>
+              <w:jc w:val="left"/>
+            </w:pPr>
+            <w:r/>
+            <w:r>
+              <w:rPr>
+                <w:rFonts w:ascii="Times New Roman" w:hAnsi="Times New Roman"/>
+                <w:sz w:val="19"/>
+              </w:rPr>
+              <w:t>Python</w:t>
+            </w:r>
+          </w:p>
+        </w:tc>
+        <w:tc>
+          <w:tcPr>
+            <w:tcW w:type="dxa" w:w="2986"/>
+          </w:tcPr>
+          <w:p>
+            <w:pPr>
+              <w:jc w:val="center"/>
+            </w:pPr>
+            <w:r/>
+            <w:r>
+              <w:rPr>
+                <w:rFonts w:ascii="Times New Roman" w:hAnsi="Times New Roman"/>
+                <w:sz w:val="19"/>
+              </w:rPr>
+              <w:t>3.11 (psutil; python-docx)</w:t>
+            </w:r>
+          </w:p>
+        </w:tc>
+        <w:tc>
+          <w:tcPr>
+            <w:tcW w:type="dxa" w:w="2986"/>
+          </w:tcPr>
+          <w:p>
+            <w:pPr>
+              <w:jc w:val="center"/>
+            </w:pPr>
+            <w:r/>
+            <w:r>
+              <w:rPr>
+                <w:rFonts w:ascii="Times New Roman" w:hAnsi="Times New Roman"/>
+                <w:sz w:val="19"/>
+              </w:rPr>
+              <w:t>harness e geração dos documentos</w:t>
+            </w:r>
+          </w:p>
+        </w:tc>
+      </w:tr>
+      <w:tr>
+        <w:tc>
+          <w:tcPr>
+            <w:tcW w:type="dxa" w:w="2986"/>
+          </w:tcPr>
+          <w:p>
+            <w:pPr>
+              <w:jc w:val="left"/>
+            </w:pPr>
+            <w:r/>
+            <w:r>
+              <w:rPr>
+                <w:rFonts w:ascii="Times New Roman" w:hAnsi="Times New Roman"/>
+                <w:sz w:val="19"/>
+              </w:rPr>
+              <w:t>ESP-IDF</w:t>
+            </w:r>
+          </w:p>
+        </w:tc>
+        <w:tc>
+          <w:tcPr>
+            <w:tcW w:type="dxa" w:w="2986"/>
+          </w:tcPr>
+          <w:p>
+            <w:pPr>
+              <w:jc w:val="center"/>
+            </w:pPr>
+            <w:r/>
+            <w:r>
+              <w:rPr>
+                <w:rFonts w:ascii="Times New Roman" w:hAnsi="Times New Roman"/>
+                <w:sz w:val="19"/>
+              </w:rPr>
+              <w:t>v5.5.4</w:t>
+            </w:r>
+          </w:p>
+        </w:tc>
+        <w:tc>
+          <w:tcPr>
+            <w:tcW w:type="dxa" w:w="2986"/>
+          </w:tcPr>
+          <w:p>
+            <w:pPr>
+              <w:jc w:val="center"/>
+            </w:pPr>
+            <w:r/>
+            <w:r>
+              <w:rPr>
+                <w:rFonts w:ascii="Times New Roman" w:hAnsi="Times New Roman"/>
+                <w:sz w:val="19"/>
+              </w:rPr>
+              <w:t>compilação para ESP32 e medição de footprint</w:t>
+            </w:r>
+          </w:p>
+        </w:tc>
+      </w:tr>
+      <w:tr>
+        <w:tc>
+          <w:tcPr>
+            <w:tcW w:type="dxa" w:w="2986"/>
+          </w:tcPr>
+          <w:p>
+            <w:pPr>
+              <w:jc w:val="left"/>
+            </w:pPr>
+            <w:r/>
+            <w:r>
+              <w:rPr>
+                <w:rFonts w:ascii="Times New Roman" w:hAnsi="Times New Roman"/>
+                <w:sz w:val="19"/>
+              </w:rPr>
+              <w:t>Toolchain xtensa</w:t>
+            </w:r>
+          </w:p>
+        </w:tc>
+        <w:tc>
+          <w:tcPr>
+            <w:tcW w:type="dxa" w:w="2986"/>
+          </w:tcPr>
+          <w:p>
+            <w:pPr>
+              <w:jc w:val="center"/>
+            </w:pPr>
+            <w:r/>
+            <w:r>
+              <w:rPr>
+                <w:rFonts w:ascii="Times New Roman" w:hAnsi="Times New Roman"/>
+                <w:sz w:val="19"/>
+              </w:rPr>
+              <w:t>xtensa-esp-elf 14.2.0</w:t>
+            </w:r>
+          </w:p>
+        </w:tc>
+        <w:tc>
+          <w:tcPr>
+            <w:tcW w:type="dxa" w:w="2986"/>
+          </w:tcPr>
+          <w:p>
+            <w:pPr>
+              <w:jc w:val="center"/>
+            </w:pPr>
+            <w:r/>
+            <w:r>
+              <w:rPr>
+                <w:rFonts w:ascii="Times New Roman" w:hAnsi="Times New Roman"/>
+                <w:sz w:val="19"/>
+              </w:rPr>
+              <w:t>compilador cruzado do ESP-IDF</w:t>
+            </w:r>
+          </w:p>
+        </w:tc>
+      </w:tr>
+      <w:tr>
+        <w:tc>
+          <w:tcPr>
+            <w:tcW w:type="dxa" w:w="2986"/>
+          </w:tcPr>
+          <w:p>
+            <w:pPr>
+              <w:jc w:val="left"/>
+            </w:pPr>
+            <w:r/>
+            <w:r>
+              <w:rPr>
+                <w:rFonts w:ascii="Times New Roman" w:hAnsi="Times New Roman"/>
+                <w:sz w:val="19"/>
+              </w:rPr>
+              <w:t>QEMU</w:t>
+            </w:r>
+          </w:p>
+        </w:tc>
+        <w:tc>
+          <w:tcPr>
+            <w:tcW w:type="dxa" w:w="2986"/>
+          </w:tcPr>
+          <w:p>
+            <w:pPr>
+              <w:jc w:val="center"/>
+            </w:pPr>
+            <w:r/>
+            <w:r>
+              <w:rPr>
+                <w:rFonts w:ascii="Times New Roman" w:hAnsi="Times New Roman"/>
+                <w:sz w:val="19"/>
+              </w:rPr>
+              <w:t>qemu-xtensa (Espressif)</w:t>
+            </w:r>
+          </w:p>
+        </w:tc>
+        <w:tc>
+          <w:tcPr>
+            <w:tcW w:type="dxa" w:w="2986"/>
+          </w:tcPr>
+          <w:p>
+            <w:pPr>
+              <w:jc w:val="center"/>
+            </w:pPr>
+            <w:r/>
+            <w:r>
+              <w:rPr>
+                <w:rFonts w:ascii="Times New Roman" w:hAnsi="Times New Roman"/>
+                <w:sz w:val="19"/>
+              </w:rPr>
+              <w:t>execução emulada do firmware</w:t>
+            </w:r>
+          </w:p>
+        </w:tc>
+      </w:tr>
+    </w:tbl>
+    <w:p>
+      <w:pPr>
+        <w:pStyle w:val="Heading1"/>
+      </w:pPr>
+      <w:r>
+        <w:rPr>
+          <w:rFonts w:ascii="Times New Roman" w:hAnsi="Times New Roman"/>
+          <w:b/>
+          <w:color w:val="000000"/>
+        </w:rPr>
+        <w:t>Apêndice E. Resolução de problemas comuns</w:t>
+      </w:r>
+    </w:p>
+    <w:p>
+      <w:pPr>
+        <w:spacing w:before="0" w:after="120"/>
+        <w:jc w:val="both"/>
+      </w:pPr>
+      <w:r>
+        <w:rPr>
+          <w:rFonts w:ascii="Times New Roman" w:hAnsi="Times New Roman"/>
+          <w:b w:val="0"/>
+          <w:i w:val="0"/>
+          <w:sz w:val="22"/>
+        </w:rPr>
+        <w:t>Esta seção reúne percalços observados durante a reprodução e suas soluções.</w:t>
+      </w:r>
+    </w:p>
+    <w:p>
+      <w:pPr>
+        <w:spacing w:after="80"/>
+      </w:pPr>
+      <w:r>
+        <w:rPr>
+          <w:rFonts w:ascii="Times New Roman" w:hAnsi="Times New Roman"/>
+          <w:b/>
+          <w:sz w:val="22"/>
+        </w:rPr>
+        <w:t xml:space="preserve">Falha de ligação ao compilar o motor. </w:t>
+      </w:r>
+      <w:r>
+        <w:rPr>
+          <w:rFonts w:ascii="Times New Roman" w:hAnsi="Times New Roman"/>
+          <w:sz w:val="22"/>
+        </w:rPr>
+        <w:t>o ligador MSVC falha neste projeto; use a cadeia GNU, com rustc +stable-x86_64-pc-windows-gnu.</w:t>
+      </w:r>
+    </w:p>
+    <w:p>
+      <w:pPr>
+        <w:spacing w:after="80"/>
+      </w:pPr>
+      <w:r>
+        <w:rPr>
+          <w:rFonts w:ascii="Times New Roman" w:hAnsi="Times New Roman"/>
+          <w:b/>
+          <w:sz w:val="22"/>
+        </w:rPr>
+        <w:t xml:space="preserve">Documentos não regeneram após instalar o ESP-IDF. </w:t>
+      </w:r>
+      <w:r>
+        <w:rPr>
+          <w:rFonts w:ascii="Times New Roman" w:hAnsi="Times New Roman"/>
+          <w:sz w:val="22"/>
+        </w:rPr>
+        <w:t>o ESP-IDF coloca o seu próprio Python no caminho de busca, e nele a biblioteca python-docx não está instalada; invoque os scripts gen_artigo.py e gen_doc.py com o interpretador Python onde o python-docx está presente.</w:t>
+      </w:r>
+    </w:p>
+    <w:p>
+      <w:pPr>
+        <w:spacing w:after="80"/>
+      </w:pPr>
+      <w:r>
+        <w:rPr>
+          <w:rFonts w:ascii="Times New Roman" w:hAnsi="Times New Roman"/>
+          <w:b/>
+          <w:sz w:val="22"/>
+        </w:rPr>
+        <w:t xml:space="preserve">idf.py qemu acusa qemu-system-xtensa ausente. </w:t>
+      </w:r>
+      <w:r>
+        <w:rPr>
+          <w:rFonts w:ascii="Times New Roman" w:hAnsi="Times New Roman"/>
+          <w:sz w:val="22"/>
+        </w:rPr>
+        <w:t>instale o emulador da Espressif com python %IDF_PATH%\tools\idf_tools.py install qemu-xtensa e reabra o terminal do ESP-IDF para que ele entre no caminho de busca.</w:t>
+      </w:r>
+    </w:p>
+    <w:p>
+      <w:pPr>
+        <w:spacing w:after="80"/>
+      </w:pPr>
+      <w:r>
+        <w:rPr>
+          <w:rFonts w:ascii="Times New Roman" w:hAnsi="Times New Roman"/>
+          <w:b/>
+          <w:sz w:val="22"/>
+        </w:rPr>
+        <w:t xml:space="preserve">Latência do QEMU diferente do esperado. </w:t>
+      </w:r>
+      <w:r>
+        <w:rPr>
+          <w:rFonts w:ascii="Times New Roman" w:hAnsi="Times New Roman"/>
+          <w:sz w:val="22"/>
+        </w:rPr>
+        <w:t>o emulador não reproduz o ciclo exato do silício; a latência ali é indicativa. Para latência e energia reais, use a placa física.</w:t>
+      </w:r>
+    </w:p>
+    <w:p>
+      <w:pPr>
+        <w:spacing w:after="80"/>
+      </w:pPr>
+      <w:r>
+        <w:rPr>
+          <w:rFonts w:ascii="Times New Roman" w:hAnsi="Times New Roman"/>
+          <w:b/>
+          <w:sz w:val="22"/>
+        </w:rPr>
+        <w:t xml:space="preserve">zstd --train recusa por poucas amostras. </w:t>
+      </w:r>
+      <w:r>
+        <w:rPr>
+          <w:rFonts w:ascii="Times New Roman" w:hAnsi="Times New Roman"/>
+          <w:sz w:val="22"/>
+        </w:rPr>
+        <w:t>treine o dicionário no modo de blocos, com a opção -B sobre um arquivo concatenado, em vez de um arquivo por amostra; foi o que o harness adotou.</w:t>
       </w:r>
     </w:p>
     <w:sectPr>

</xml_diff>

<commit_message>
docs: revisao final de consistencia (legenda da tabela de comandos + renumeracao; citacao Hebrail->Hebrail acentuada)
Co-Authored-By: Claude Opus 4.8 <noreply@anthropic.com>
</commit_message>
<xml_diff>
--- a/artigo/GhostPredict_Documentacao.docx
+++ b/artigo/GhostPredict_Documentacao.docx
@@ -4662,6 +4662,36 @@
           <w:color w:val="000000"/>
         </w:rPr>
         <w:t>9.2. Referência de comandos</w:t>
+      </w:r>
+    </w:p>
+    <w:p>
+      <w:pPr>
+        <w:spacing w:before="0" w:after="120"/>
+        <w:jc w:val="both"/>
+      </w:pPr>
+      <w:r>
+        <w:rPr>
+          <w:rFonts w:ascii="Times New Roman" w:hAnsi="Times New Roman"/>
+          <w:b w:val="0"/>
+          <w:i w:val="0"/>
+          <w:sz w:val="22"/>
+        </w:rPr>
+        <w:t>A Tabela 1 reúne os comandos da interface de linha de comando do motor.</w:t>
+      </w:r>
+    </w:p>
+    <w:p>
+      <w:pPr>
+        <w:spacing w:before="120" w:after="80"/>
+        <w:jc w:val="center"/>
+      </w:pPr>
+      <w:r>
+        <w:rPr>
+          <w:rFonts w:ascii="Arial" w:hAnsi="Arial"/>
+          <w:b/>
+          <w:i w:val="0"/>
+          <w:sz w:val="19"/>
+        </w:rPr>
+        <w:t>Tabela 1. Comandos da interface de linha de comando.</w:t>
       </w:r>
     </w:p>
     <w:tbl>
@@ -5035,7 +5065,7 @@
           <w:i w:val="0"/>
           <w:sz w:val="22"/>
         </w:rPr>
-        <w:t>O comando bench cronometra a compressão e a descompressão em memória, sem I/O de disco, e reporta o pico de heap de cada uma. A saída é uma linha parseável. Os valores medidos para uma mensagem típica e para uma entrada de 64 KB estão na Tabela 8 da Seção 11.</w:t>
+        <w:t>O comando bench cronometra a compressão e a descompressão em memória, sem I/O de disco, e reporta o pico de heap de cada uma. A saída é uma linha parseável. Os valores medidos para uma mensagem típica e para uma entrada de 64 KB estão na Tabela 9 da Seção 11.</w:t>
       </w:r>
     </w:p>
     <w:p>
@@ -5091,7 +5121,7 @@
           <w:i w:val="0"/>
           <w:sz w:val="22"/>
         </w:rPr>
-        <w:t>São onze fluxos de registros curtos de oito fontes públicas. A Tabela 1 lista a procedência. Cada fonte é tratada como um fluxo com um registro por linha; para o GeoLife, descartam-se as seis linhas de cabeçalho de cada arquivo de trajetória.</w:t>
+        <w:t>São onze fluxos de registros curtos de oito fontes públicas. A Tabela 2 lista a procedência. Cada fonte é tratada como um fluxo com um registro por linha; para o GeoLife, descartam-se as seis linhas de cabeçalho de cada arquivo de trajetória.</w:t>
       </w:r>
     </w:p>
     <w:p>
@@ -5106,7 +5136,7 @@
           <w:i w:val="0"/>
           <w:sz w:val="19"/>
         </w:rPr>
-        <w:t>Tabela 1. Procedência dos conjuntos de dados.</w:t>
+        <w:t>Tabela 2. Procedência dos conjuntos de dados.</w:t>
       </w:r>
     </w:p>
     <w:tbl>
@@ -5967,7 +5997,7 @@
           <w:i w:val="0"/>
           <w:sz w:val="22"/>
         </w:rPr>
-        <w:t>Para responder à pergunta sobre a dependência de domínio, executa-se ainda um experimento cruzado: o primer de um domínio é usado para comprimir as mensagens de teste de outro domínio, formando a matriz da Tabela 6. A variante enxuta e o experimento cruzado atendem a uma exigência de rigor: separar o quanto do ganho vem do formato sem cabeçalho do quanto vem do modelo aquecido, e medir o que ocorre quando o prior não casa com o domínio.</w:t>
+        <w:t>Para responder à pergunta sobre a dependência de domínio, executa-se ainda um experimento cruzado: o primer de um domínio é usado para comprimir as mensagens de teste de outro domínio, formando a matriz da Tabela 7. A variante enxuta e o experimento cruzado atendem a uma exigência de rigor: separar o quanto do ganho vem do formato sem cabeçalho do quanto vem do modelo aquecido, e medir o que ocorre quando o prior não casa com o domínio.</w:t>
       </w:r>
     </w:p>
     <w:p>
@@ -5995,7 +6025,7 @@
           <w:i w:val="0"/>
           <w:sz w:val="22"/>
         </w:rPr>
-        <w:t>A reprodução exige um pequeno conjunto de ferramentas, todas verificadas pelo próprio benchmark.py antes de iniciar. São elas o compilador Rust com a cadeia GNU; o compilador C, para os especialistas de string curta; os utilitários zstd, xz, gzip e brotli no caminho de busca; e o interpretador Python com a biblioteca psutil, opcional, para a medição de memória. As versões usadas estão no Apêndice D. Os conjuntos de dados, por serem grandes, não acompanham o repositório; suas fontes públicas estão na Tabela 1, e a estrutura de pastas esperada está documentada nas funções de extração do benchmark.py.</w:t>
+        <w:t>A reprodução exige um pequeno conjunto de ferramentas, todas verificadas pelo próprio benchmark.py antes de iniciar. São elas o compilador Rust com a cadeia GNU; o compilador C, para os especialistas de string curta; os utilitários zstd, xz, gzip e brotli no caminho de busca; e o interpretador Python com a biblioteca psutil, opcional, para a medição de memória. As versões usadas estão no Apêndice D. Os conjuntos de dados, por serem grandes, não acompanham o repositório; suas fontes públicas estão na Tabela 2, e a estrutura de pastas esperada está documentada nas funções de extração do benchmark.py.</w:t>
       </w:r>
     </w:p>
     <w:p>
@@ -6422,7 +6452,7 @@
           <w:i w:val="0"/>
           <w:sz w:val="22"/>
         </w:rPr>
-        <w:t>A Tabela 2 traz o tamanho médio do comprimido, em bytes, por domínio e configuração, incluindo a variante enxuta do dicionário do zstd e os especialistas de string curta. Valores menores são melhores.</w:t>
+        <w:t>A Tabela 3 traz o tamanho médio do comprimido, em bytes, por domínio e configuração, incluindo a variante enxuta do dicionário do zstd e os especialistas de string curta. Valores menores são melhores.</w:t>
       </w:r>
     </w:p>
     <w:p>
@@ -6437,7 +6467,7 @@
           <w:i w:val="0"/>
           <w:sz w:val="19"/>
         </w:rPr>
-        <w:t>Tabela 2. Tamanho médio do comprimido por mensagem, em bytes.</w:t>
+        <w:t>Tabela 3. Tamanho médio do comprimido por mensagem, em bytes.</w:t>
       </w:r>
     </w:p>
     <w:tbl>
@@ -8491,7 +8521,7 @@
           <w:i w:val="0"/>
           <w:sz w:val="22"/>
         </w:rPr>
-        <w:t>A Tabela 3 decompõe, em bytes médios por mensagem, a vantagem do GPA com prior sobre o dicionário do zstd. A coluna de moldura removível é a soma de verificação e o identificador de dicionário eliminados pela variante enxuta, da ordem de oito bytes constantes; a coluna de modelo e formato é o restante, que combina o modelo aquecido pelo prior e o cabeçalho irredutível do zstd que o formato sem cabeçalho também evita.</w:t>
+        <w:t>A Tabela 4 decompõe, em bytes médios por mensagem, a vantagem do GPA com prior sobre o dicionário do zstd. A coluna de moldura removível é a soma de verificação e o identificador de dicionário eliminados pela variante enxuta, da ordem de oito bytes constantes; a coluna de modelo e formato é o restante, que combina o modelo aquecido pelo prior e o cabeçalho irredutível do zstd que o formato sem cabeçalho também evita.</w:t>
       </w:r>
     </w:p>
     <w:p>
@@ -8506,7 +8536,7 @@
           <w:i w:val="0"/>
           <w:sz w:val="19"/>
         </w:rPr>
-        <w:t>Tabela 3. Decomposição da vantagem do GPA com prior sobre o zstd-dict (bytes por mensagem).</w:t>
+        <w:t>Tabela 4. Decomposição da vantagem do GPA com prior sobre o zstd-dict (bytes por mensagem).</w:t>
       </w:r>
     </w:p>
     <w:tbl>
@@ -9440,7 +9470,7 @@
           <w:i w:val="0"/>
           <w:sz w:val="22"/>
         </w:rPr>
-        <w:t>A vantagem não se deve a poucos casos extremos. A Tabela 4 mostra que, para o GPA com prior, a mediana e o percentil 95 do tamanho por mensagem ficam próximos da média em todos os domínios, o que indica uma distribuição concentrada.</w:t>
+        <w:t>A vantagem não se deve a poucos casos extremos. A Tabela 5 mostra que, para o GPA com prior, a mediana e o percentil 95 do tamanho por mensagem ficam próximos da média em todos os domínios, o que indica uma distribuição concentrada.</w:t>
       </w:r>
     </w:p>
     <w:p>
@@ -9455,7 +9485,7 @@
           <w:i w:val="0"/>
           <w:sz w:val="19"/>
         </w:rPr>
-        <w:t>Tabela 4. GPA com prior: média, mediana e percentil 95 do tamanho (bytes).</w:t>
+        <w:t>Tabela 5. GPA com prior: média, mediana e percentil 95 do tamanho (bytes).</w:t>
       </w:r>
     </w:p>
     <w:tbl>
@@ -10389,7 +10419,7 @@
           <w:i w:val="0"/>
           <w:sz w:val="22"/>
         </w:rPr>
-        <w:t>A Tabela 5 mostra a fração de mensagens que cada ferramenta expande e a fração em que o GPA com prior vence. Ela evidencia o problema que motiva o trabalho, pois no regime de poucas dezenas de bytes gzip e xz, e o SMAZ em dado estruturado, frequentemente aumentam o dado.</w:t>
+        <w:t>A Tabela 6 mostra a fração de mensagens que cada ferramenta expande e a fração em que o GPA com prior vence. Ela evidencia o problema que motiva o trabalho, pois no regime de poucas dezenas de bytes gzip e xz, e o SMAZ em dado estruturado, frequentemente aumentam o dado.</w:t>
       </w:r>
     </w:p>
     <w:p>
@@ -10404,7 +10434,7 @@
           <w:i w:val="0"/>
           <w:sz w:val="19"/>
         </w:rPr>
-        <w:t>Tabela 5. Vitórias do GPA com prior e mensagens expandidas por outras ferramentas (%).</w:t>
+        <w:t>Tabela 6. Vitórias do GPA com prior e mensagens expandidas por outras ferramentas (%).</w:t>
       </w:r>
     </w:p>
     <w:tbl>
@@ -11774,7 +11804,7 @@
           <w:i w:val="0"/>
           <w:sz w:val="22"/>
         </w:rPr>
-        <w:t>A Tabela 6 quantifica o que ocorre quando o prior não casa com o domínio. Cada célula é o tamanho médio do comprimido ao usar o primer do domínio da coluna para comprimir as mensagens de teste do domínio da linha. A diagonal, com primer casado, é sempre a menor; fora dela o tamanho cresce de forma acentuada e pode aproximar-se ou exceder o tamanho original, o que mostra que o ganho depende criticamente de um prior compatível com a aplicação.</w:t>
+        <w:t>A Tabela 7 quantifica o que ocorre quando o prior não casa com o domínio. Cada célula é o tamanho médio do comprimido ao usar o primer do domínio da coluna para comprimir as mensagens de teste do domínio da linha. A diagonal, com primer casado, é sempre a menor; fora dela o tamanho cresce de forma acentuada e pode aproximar-se ou exceder o tamanho original, o que mostra que o ganho depende criticamente de um prior compatível com a aplicação.</w:t>
       </w:r>
     </w:p>
     <w:p>
@@ -11789,7 +11819,7 @@
           <w:i w:val="0"/>
           <w:sz w:val="19"/>
         </w:rPr>
-        <w:t>Tabela 6. Tamanho médio (bytes) com primer cruzado: linha é o teste, coluna é o primer.</w:t>
+        <w:t>Tabela 7. Tamanho médio (bytes) com primer cruzado: linha é o teste, coluna é o primer.</w:t>
       </w:r>
     </w:p>
     <w:tbl>
@@ -12499,7 +12529,7 @@
           <w:i w:val="0"/>
           <w:sz w:val="22"/>
         </w:rPr>
-        <w:t>É preciso separar duas medidas distintas de recurso. A Tabela 7 traz a vazão e o pico de memória residente do processo no computador de teste, sobre lotes concatenados. Esse pico de processo inclui o binário e o sistema operacional e não representa o consumo do algoritmo embarcado; serve apenas para comparar o uso relativo de recursos entre as ferramentas no host, onde o GPA já usa muito menos que os compressores de janela longa.</w:t>
+        <w:t>É preciso separar duas medidas distintas de recurso. A Tabela 8 traz a vazão e o pico de memória residente do processo no computador de teste, sobre lotes concatenados. Esse pico de processo inclui o binário e o sistema operacional e não representa o consumo do algoritmo embarcado; serve apenas para comparar o uso relativo de recursos entre as ferramentas no host, onde o GPA já usa muito menos que os compressores de janela longa.</w:t>
       </w:r>
     </w:p>
     <w:p>
@@ -12514,7 +12544,7 @@
           <w:i w:val="0"/>
           <w:sz w:val="19"/>
         </w:rPr>
-        <w:t>Tabela 7. Vazão média e pico de memória do processo no host (não é o footprint embarcado).</w:t>
+        <w:t>Tabela 8. Vazão média e pico de memória do processo no host (não é o footprint embarcado).</w:t>
       </w:r>
     </w:p>
     <w:tbl>
@@ -12950,7 +12980,7 @@
           <w:i w:val="0"/>
           <w:sz w:val="22"/>
         </w:rPr>
-        <w:t>O número relevante para microcontroladores não é o pico de processo, mas o conjunto de trabalho do motor, medido pelo alocador instrumentado e independente do tamanho da mensagem no perfil micro. A Tabela 8 reporta esse footprint. A ele soma-se o primer, que ocupa de 16 a 32 KB na memória de programa do dispositivo, pois reside no codec e não no arquivo; esse é um custo honesto a declarar, ainda que não trafegue em cada mensagem.</w:t>
+        <w:t>O número relevante para microcontroladores não é o pico de processo, mas o conjunto de trabalho do motor, medido pelo alocador instrumentado e independente do tamanho da mensagem no perfil micro. A Tabela 9 reporta esse footprint. A ele soma-se o primer, que ocupa de 16 a 32 KB na memória de programa do dispositivo, pois reside no codec e não no arquivo; esse é um custo honesto a declarar, ainda que não trafegue em cada mensagem.</w:t>
       </w:r>
     </w:p>
     <w:p>
@@ -12965,7 +12995,7 @@
           <w:i w:val="0"/>
           <w:sz w:val="19"/>
         </w:rPr>
-        <w:t>Tabela 8. Footprint de heap do motor (alocador instrumentado), fora o primer.</w:t>
+        <w:t>Tabela 9. Footprint de heap do motor (alocador instrumentado), fora o primer.</w:t>
       </w:r>
     </w:p>
     <w:tbl>
@@ -13263,7 +13293,7 @@
           <w:i w:val="0"/>
           <w:sz w:val="22"/>
         </w:rPr>
-        <w:t>Os experimentos anteriores estabelecem que o efeito existe, a Tabela 3 mostra de onde ele vem, e a Tabela 6 mostra onde ele deixa de valer. Reunidos, eles permitem enquadrar a proposta como uma decisão de engenharia, e não apenas como um número de compressão. A decisão troca um custo fixo por um ganho recorrente. O custo fixo é o primer, de 16 a 32 KB na memória de programa do dispositivo (Tabela 8), pago uma única vez na gravação do firmware e nunca transmitido. O ganho recorrente é a redução de cerca de duas a três vezes sobre o dicionário do zstd, ou de cerca de 1,7 vezes quando se isola o modelo do formato, em cada mensagem enviada.</w:t>
+        <w:t>Os experimentos anteriores estabelecem que o efeito existe, a Tabela 4 mostra de onde ele vem, e a Tabela 7 mostra onde ele deixa de valer. Reunidos, eles permitem enquadrar a proposta como uma decisão de engenharia, e não apenas como um número de compressão. A decisão troca um custo fixo por um ganho recorrente. O custo fixo é o primer, de 16 a 32 KB na memória de programa do dispositivo (Tabela 9), pago uma única vez na gravação do firmware e nunca transmitido. O ganho recorrente é a redução de cerca de duas a três vezes sobre o dicionário do zstd, ou de cerca de 1,7 vezes quando se isola o modelo do formato, em cada mensagem enviada.</w:t>
       </w:r>
     </w:p>
     <w:p>
@@ -13278,7 +13308,7 @@
           <w:i w:val="0"/>
           <w:sz w:val="22"/>
         </w:rPr>
-        <w:t>O balanço depende de três grandezas: a memória de programa investida, a memória de trabalho em execução e os bytes economizados por mensagem. A memória de programa, de dezenas de quilobytes, é abundante nos microcontroladores usuais, cuja flash é da ordem de megabytes. A memória de trabalho do decodificador, de cerca de 19 KB, cabe com folga na RAM desses dispositivos. E a economia por mensagem se acumula a cada transmissão, de modo que, em um dispositivo que envia muitas mensagens curtas por enlaces onde cada byte custa energia e tempo de antena, o investimento fixo é rapidamente compensado. A condição para que o trade-off compense é a estabilidade do domínio: o experimento cruzado da Tabela 6 mostra que um primer descasado anula o ganho e pode inflar. O método é, assim, indicado quando o domínio é estável e o volume de mensagens é alto, e contraindicado quando o tráfego é heterogêneo ou a memória de programa é criticamente escassa. A pergunta útil sobre o trabalho não é se o ganho é real, e sim em que regimes esse trade-off entre flash, RAM e compressão se paga.</w:t>
+        <w:t>O balanço depende de três grandezas: a memória de programa investida, a memória de trabalho em execução e os bytes economizados por mensagem. A memória de programa, de dezenas de quilobytes, é abundante nos microcontroladores usuais, cuja flash é da ordem de megabytes. A memória de trabalho do decodificador, de cerca de 19 KB, cabe com folga na RAM desses dispositivos. E a economia por mensagem se acumula a cada transmissão, de modo que, em um dispositivo que envia muitas mensagens curtas por enlaces onde cada byte custa energia e tempo de antena, o investimento fixo é rapidamente compensado. A condição para que o trade-off compense é a estabilidade do domínio: o experimento cruzado da Tabela 7 mostra que um primer descasado anula o ganho e pode inflar. O método é, assim, indicado quando o domínio é estável e o volume de mensagens é alto, e contraindicado quando o tráfego é heterogêneo ou a memória de programa é criticamente escassa. A pergunta útil sobre o trabalho não é se o ganho é real, e sim em que regimes esse trade-off entre flash, RAM e compressão se paga.</w:t>
       </w:r>
     </w:p>
     <w:p>
@@ -13293,7 +13323,7 @@
           <w:i w:val="0"/>
           <w:sz w:val="22"/>
         </w:rPr>
-        <w:t>A Tabela 9 reúne, em um único lugar, os custos do prior, antes dispersos pelo texto, tornando o trade-off imediatamente visível.</w:t>
+        <w:t>A Tabela 10 reúne, em um único lugar, os custos do prior, antes dispersos pelo texto, tornando o trade-off imediatamente visível.</w:t>
       </w:r>
     </w:p>
     <w:p>
@@ -13308,7 +13338,7 @@
           <w:i w:val="0"/>
           <w:sz w:val="19"/>
         </w:rPr>
-        <w:t>Tabela 9. Custos do prior (resumo do trade-off).</w:t>
+        <w:t>Tabela 10. Custos do prior (resumo do trade-off).</w:t>
       </w:r>
     </w:p>
     <w:tbl>
@@ -13509,7 +13539,7 @@
                 <w:rFonts w:ascii="Times New Roman" w:hAnsi="Times New Roman"/>
                 <w:sz w:val="20"/>
               </w:rPr>
-              <w:t>até cerca de 10 vezes (Tabela 6)</w:t>
+              <w:t>até cerca de 10 vezes (Tabela 7)</w:t>
             </w:r>
           </w:p>
         </w:tc>
@@ -13774,7 +13804,7 @@
           <w:i w:val="0"/>
           <w:sz w:val="22"/>
         </w:rPr>
-        <w:t>Esses números validam, de forma reproduzível e sem hardware, a parte estática do footprint da Tabela 8: que o código e o primer cabem na flash e que as estruturas estáticas cabem na RAM. Um projeto que aloque o modelo em vetores estáticos, em vez de no heap, move o modelo para a seção .bss e torna o footprint completo diretamente visível nessa análise, sem depender de medição em tempo de execução. A Tabela 10 resume o que cada método de medição cobre.</w:t>
+        <w:t>Esses números validam, de forma reproduzível e sem hardware, a parte estática do footprint da Tabela 9: que o código e o primer cabem na flash e que as estruturas estáticas cabem na RAM. Um projeto que aloque o modelo em vetores estáticos, em vez de no heap, move o modelo para a seção .bss e torna o footprint completo diretamente visível nessa análise, sem depender de medição em tempo de execução. A Tabela 11 resume o que cada método de medição cobre.</w:t>
       </w:r>
     </w:p>
     <w:p>
@@ -13789,7 +13819,7 @@
           <w:i w:val="0"/>
           <w:sz w:val="19"/>
         </w:rPr>
-        <w:t>Tabela 10. O que cada método de validação de footprint cobre.</w:t>
+        <w:t>Tabela 11. O que cada método de validação de footprint cobre.</w:t>
       </w:r>
     </w:p>
     <w:tbl>
@@ -13914,7 +13944,7 @@
                 <w:rFonts w:ascii="Times New Roman" w:hAnsi="Times New Roman"/>
                 <w:sz w:val="19"/>
               </w:rPr>
-              <w:t>pico de heap dinâmico do motor (Tabela 8)</w:t>
+              <w:t>pico de heap dinâmico do motor (Tabela 9)</w:t>
             </w:r>
           </w:p>
         </w:tc>
@@ -14115,7 +14145,7 @@
           <w:i w:val="0"/>
           <w:sz w:val="22"/>
         </w:rPr>
-        <w:t>Essa validação deixou de ser apenas uma proposta. O repositório inclui, em embedded/, um decodificador de referência em C sem alocação dinâmica, com todo o estado em memória estática, portado de ghost_core.rs e empacotado como componente ESP-IDF. Ele foi verificado bit a bit contra o motor Rust nos vetores de conformidade e em mensagens reais, em modo normal e com prior, com doze de doze casos exatos. Compilado para o ESP32 com o ESP-IDF, o relatório idf.py size-components atribui ao componente do decodificador 19.692 bytes na seção .bss, 1.811 bytes de código em flash e 220 bytes de constantes, no alvo xtensa real. A Tabela 11 reúne as três medições independentes de RAM do decodificador, que convergem em torno de 19 KB e confirmam a linha da Tabela 8 no próprio hardware de destino.</w:t>
+        <w:t>Essa validação deixou de ser apenas uma proposta. O repositório inclui, em embedded/, um decodificador de referência em C sem alocação dinâmica, com todo o estado em memória estática, portado de ghost_core.rs e empacotado como componente ESP-IDF. Ele foi verificado bit a bit contra o motor Rust nos vetores de conformidade e em mensagens reais, em modo normal e com prior, com doze de doze casos exatos. Compilado para o ESP32 com o ESP-IDF, o relatório idf.py size-components atribui ao componente do decodificador 19.692 bytes na seção .bss, 1.811 bytes de código em flash e 220 bytes de constantes, no alvo xtensa real. A Tabela 12 reúne as três medições independentes de RAM do decodificador, que convergem em torno de 19 KB e confirmam a linha da Tabela 9 no próprio hardware de destino.</w:t>
       </w:r>
     </w:p>
     <w:p>
@@ -14130,7 +14160,7 @@
           <w:i w:val="0"/>
           <w:sz w:val="19"/>
         </w:rPr>
-        <w:t>Tabela 11. Footprint de RAM do decodificador por três métodos independentes.</w:t>
+        <w:t>Tabela 12. Footprint de RAM do decodificador por três métodos independentes.</w:t>
       </w:r>
     </w:p>
     <w:tbl>
@@ -14651,7 +14681,7 @@
           <w:i w:val="0"/>
           <w:sz w:val="22"/>
         </w:rPr>
-        <w:t>Na medição usada nesta documentação, o componente gpa_decoder apareceu com 19.692 bytes de .bss, 1.811 bytes de .text em flash e 220 bytes de .rodata, no alvo xtensa, exatamente os valores da Tabela 11. Para executar o decoder no emulador, instala-se o QEMU da Espressif e roda-se o monitor:</w:t>
+        <w:t>Na medição usada nesta documentação, o componente gpa_decoder apareceu com 19.692 bytes de .bss, 1.811 bytes de .text em flash e 220 bytes de .rodata, no alvo xtensa, exatamente os valores da Tabela 12. Para executar o decoder no emulador, instala-se o QEMU da Espressif e roda-se o monitor:</w:t>
       </w:r>
     </w:p>
     <w:p>

</xml_diff>